<commit_message>
Fix the Google Docs table widths and refuse unused flags
Every table of the Google Docs files now has a fixed width whose
columns add up to the text width, the files carry no heading list,
and --gdocs refuses --face and --docx. The README states what the
converted files keep: the 6 named styles with the lab look, and the
other styles only as the look of their sample text.
</commit_message>
<xml_diff>
--- a/templates/Forming Worlds Handbook (Google Docs).docx
+++ b/templates/Forming Worlds Handbook (Google Docs).docx
@@ -195,37 +195,6 @@
 
 <file path=word/numbering.xml><?xml version="1.0" encoding="utf-8"?>
 <w:numbering xmlns:wpc="http://schemas.microsoft.com/office/word/2010/wordprocessingCanvas" xmlns:mo="http://schemas.microsoft.com/office/mac/office/2008/main" xmlns:mc="http://schemas.openxmlformats.org/markup-compatibility/2006" xmlns:mv="urn:schemas-microsoft-com:mac:vml" xmlns:o="urn:schemas-microsoft-com:office:office" xmlns:r="http://schemas.openxmlformats.org/officeDocument/2006/relationships" xmlns:m="http://schemas.openxmlformats.org/officeDocument/2006/math" xmlns:v="urn:schemas-microsoft-com:vml" xmlns:wp14="http://schemas.microsoft.com/office/word/2010/wordprocessingDrawing" xmlns:wp="http://schemas.openxmlformats.org/drawingml/2006/wordprocessingDrawing" xmlns:w10="urn:schemas-microsoft-com:office:word" xmlns:w="http://schemas.openxmlformats.org/wordprocessingml/2006/main" xmlns:w14="http://schemas.microsoft.com/office/word/2010/wordml" xmlns:wpg="http://schemas.microsoft.com/office/word/2010/wordprocessingGroup" xmlns:wpi="http://schemas.microsoft.com/office/word/2010/wordprocessingInk" xmlns:wne="http://schemas.microsoft.com/office/word/2006/wordml" xmlns:wps="http://schemas.microsoft.com/office/word/2010/wordprocessingShape" mc:Ignorable="w14 wp14">
-  <w:abstractNum w:abstractNumId="90">
-    <w:multiLevelType w:val="multilevel"/>
-    <w:lvl w:ilvl="0">
-      <w:start w:val="1"/>
-      <w:numFmt w:val="decimal"/>
-      <w:pStyle w:val="Heading1"/>
-      <w:lvlText w:val="%1"/>
-      <w:lvlJc w:val="left"/>
-      <w:pPr>
-        <w:ind w:left="850" w:hanging="850"/>
-      </w:pPr>
-      <w:rPr>
-        <w:color w:val="0072A1"/>
-        <w:sz w:val="40"/>
-        <w:szCs w:val="40"/>
-      </w:rPr>
-    </w:lvl>
-    <w:lvl w:ilvl="1">
-      <w:start w:val="1"/>
-      <w:numFmt w:val="decimal"/>
-      <w:pStyle w:val="Heading2"/>
-      <w:lvlText w:val="%1.%2"/>
-      <w:lvlJc w:val="left"/>
-      <w:pPr>
-        <w:ind w:left="567" w:hanging="567"/>
-      </w:pPr>
-      <w:rPr>
-        <w:color w:val="0072A1"/>
-      </w:rPr>
-    </w:lvl>
-  </w:abstractNum>
   <w:abstractNum w:abstractNumId="91">
     <w:multiLevelType w:val="singleLevel"/>
     <w:lvl w:ilvl="0">
@@ -469,9 +438,6 @@
   </w:num>
   <w:num w:numId="9">
     <w:abstractNumId w:val="0"/>
-  </w:num>
-  <w:num w:numId="90">
-    <w:abstractNumId w:val="90"/>
   </w:num>
   <w:num w:numId="91">
     <w:abstractNumId w:val="91"/>

</xml_diff>